<commit_message>
Update pre vs post
</commit_message>
<xml_diff>
--- a/05-results/bacterial_mapping/Maaslin2_boxplots_pre-contact_vs_post-contact.docx
+++ b/05-results/bacterial_mapping/Maaslin2_boxplots_pre-contact_vs_post-contact.docx
@@ -56,7 +56,7 @@
           <w:noProof/>
         </w:rPr>
         <w:drawing>
-          <wp:inline distT="0" distB="0" distL="0" distR="0" wp14:anchorId="03CF8026" wp14:editId="4A73D732">
+          <wp:inline distT="0" distB="0" distL="0" distR="0" wp14:anchorId="03CF8026" wp14:editId="43606BD0">
             <wp:extent cx="3806456" cy="3806456"/>
             <wp:effectExtent l="0" t="0" r="3810" b="3810"/>
             <wp:docPr id="567814057" name="Picture 3"/>
@@ -73,7 +73,7 @@
                     </pic:cNvPicPr>
                   </pic:nvPicPr>
                   <pic:blipFill>
-                    <a:blip r:embed="rId5" cstate="print">
+                    <a:blip r:embed="rId4" cstate="print">
                       <a:extLst>
                         <a:ext uri="{28A0092B-C50C-407E-A947-70E740481C1C}">
                           <a14:useLocalDpi xmlns:a14="http://schemas.microsoft.com/office/drawing/2010/main" val="0"/>
@@ -131,7 +131,7 @@
                     </pic:cNvPicPr>
                   </pic:nvPicPr>
                   <pic:blipFill>
-                    <a:blip r:embed="rId6">
+                    <a:blip r:embed="rId5">
                       <a:extLst>
                         <a:ext uri="{28A0092B-C50C-407E-A947-70E740481C1C}">
                           <a14:useLocalDpi xmlns:a14="http://schemas.microsoft.com/office/drawing/2010/main" val="0"/>
@@ -241,7 +241,7 @@
                     </pic:cNvPicPr>
                   </pic:nvPicPr>
                   <pic:blipFill>
-                    <a:blip r:embed="rId7">
+                    <a:blip r:embed="rId6">
                       <a:extLst>
                         <a:ext uri="{28A0092B-C50C-407E-A947-70E740481C1C}">
                           <a14:useLocalDpi xmlns:a14="http://schemas.microsoft.com/office/drawing/2010/main" val="0"/>
@@ -299,7 +299,7 @@
                     </pic:cNvPicPr>
                   </pic:nvPicPr>
                   <pic:blipFill>
-                    <a:blip r:embed="rId8" cstate="print">
+                    <a:blip r:embed="rId7" cstate="print">
                       <a:extLst>
                         <a:ext uri="{28A0092B-C50C-407E-A947-70E740481C1C}">
                           <a14:useLocalDpi xmlns:a14="http://schemas.microsoft.com/office/drawing/2010/main" val="0"/>
@@ -414,7 +414,7 @@
                     </pic:cNvPicPr>
                   </pic:nvPicPr>
                   <pic:blipFill>
-                    <a:blip r:embed="rId9">
+                    <a:blip r:embed="rId8">
                       <a:extLst>
                         <a:ext uri="{28A0092B-C50C-407E-A947-70E740481C1C}">
                           <a14:useLocalDpi xmlns:a14="http://schemas.microsoft.com/office/drawing/2010/main" val="0"/>
@@ -457,7 +457,7 @@
           <w:noProof/>
         </w:rPr>
         <w:drawing>
-          <wp:inline distT="0" distB="0" distL="0" distR="0" wp14:anchorId="5B85DF74" wp14:editId="39DA5037">
+          <wp:inline distT="0" distB="0" distL="0" distR="0" wp14:anchorId="5B85DF74" wp14:editId="5EB0E57A">
             <wp:extent cx="3827721" cy="3827721"/>
             <wp:effectExtent l="0" t="0" r="1905" b="1905"/>
             <wp:docPr id="1603961655" name="Picture 4" descr="A graph with a bar chart and text&#10;&#10;AI-generated content may be incorrect."/>
@@ -474,7 +474,7 @@
                     </pic:cNvPicPr>
                   </pic:nvPicPr>
                   <pic:blipFill>
-                    <a:blip r:embed="rId10" cstate="print">
+                    <a:blip r:embed="rId9" cstate="print">
                       <a:extLst>
                         <a:ext uri="{28A0092B-C50C-407E-A947-70E740481C1C}">
                           <a14:useLocalDpi xmlns:a14="http://schemas.microsoft.com/office/drawing/2010/main" val="0"/>
@@ -588,7 +588,7 @@
                     </pic:cNvPicPr>
                   </pic:nvPicPr>
                   <pic:blipFill>
-                    <a:blip r:embed="rId11">
+                    <a:blip r:embed="rId10">
                       <a:extLst>
                         <a:ext uri="{28A0092B-C50C-407E-A947-70E740481C1C}">
                           <a14:useLocalDpi xmlns:a14="http://schemas.microsoft.com/office/drawing/2010/main" val="0"/>
@@ -633,7 +633,7 @@
           <w:noProof/>
         </w:rPr>
         <w:drawing>
-          <wp:inline distT="0" distB="0" distL="0" distR="0" wp14:anchorId="1C159D24" wp14:editId="604133F5">
+          <wp:inline distT="0" distB="0" distL="0" distR="0" wp14:anchorId="1C159D24" wp14:editId="171012E0">
             <wp:extent cx="3859619" cy="3859619"/>
             <wp:effectExtent l="0" t="0" r="7620" b="7620"/>
             <wp:docPr id="777651839" name="Picture 25" descr="A graph with a bar and a line&#10;&#10;AI-generated content may be incorrect."/>
@@ -650,7 +650,7 @@
                     </pic:cNvPicPr>
                   </pic:nvPicPr>
                   <pic:blipFill>
-                    <a:blip r:embed="rId12" cstate="print">
+                    <a:blip r:embed="rId11" cstate="print">
                       <a:extLst>
                         <a:ext uri="{28A0092B-C50C-407E-A947-70E740481C1C}">
                           <a14:useLocalDpi xmlns:a14="http://schemas.microsoft.com/office/drawing/2010/main" val="0"/>
@@ -775,7 +775,7 @@
                     </pic:cNvPicPr>
                   </pic:nvPicPr>
                   <pic:blipFill>
-                    <a:blip r:embed="rId13">
+                    <a:blip r:embed="rId12">
                       <a:extLst>
                         <a:ext uri="{28A0092B-C50C-407E-A947-70E740481C1C}">
                           <a14:useLocalDpi xmlns:a14="http://schemas.microsoft.com/office/drawing/2010/main" val="0"/>
@@ -807,7 +807,186 @@
         </w:drawing>
       </w:r>
     </w:p>
-    <w:p/>
+    <w:p>
+      <w:pPr>
+        <w:jc w:val="center"/>
+        <w:rPr>
+          <w:b/>
+          <w:bCs/>
+        </w:rPr>
+      </w:pPr>
+    </w:p>
+    <w:p>
+      <w:pPr>
+        <w:jc w:val="center"/>
+        <w:rPr>
+          <w:b/>
+          <w:bCs/>
+        </w:rPr>
+      </w:pPr>
+      <w:r>
+        <w:rPr>
+          <w:b/>
+          <w:bCs/>
+          <w:noProof/>
+          <w14:ligatures w14:val="standardContextual"/>
+        </w:rPr>
+        <w:drawing>
+          <wp:inline distT="0" distB="0" distL="0" distR="0" wp14:anchorId="2A7D1165" wp14:editId="76767005">
+            <wp:extent cx="4501661" cy="4501661"/>
+            <wp:effectExtent l="0" t="0" r="0" b="0"/>
+            <wp:docPr id="699576247" name="Picture 2"/>
+            <wp:cNvGraphicFramePr>
+              <a:graphicFrameLocks xmlns:a="http://schemas.openxmlformats.org/drawingml/2006/main" noChangeAspect="1"/>
+            </wp:cNvGraphicFramePr>
+            <a:graphic xmlns:a="http://schemas.openxmlformats.org/drawingml/2006/main">
+              <a:graphicData uri="http://schemas.openxmlformats.org/drawingml/2006/picture">
+                <pic:pic xmlns:pic="http://schemas.openxmlformats.org/drawingml/2006/picture">
+                  <pic:nvPicPr>
+                    <pic:cNvPr id="699576247" name="Picture 699576247"/>
+                    <pic:cNvPicPr/>
+                  </pic:nvPicPr>
+                  <pic:blipFill>
+                    <a:blip r:embed="rId13">
+                      <a:extLst>
+                        <a:ext uri="{28A0092B-C50C-407E-A947-70E740481C1C}">
+                          <a14:useLocalDpi xmlns:a14="http://schemas.microsoft.com/office/drawing/2010/main" val="0"/>
+                        </a:ext>
+                      </a:extLst>
+                    </a:blip>
+                    <a:stretch>
+                      <a:fillRect/>
+                    </a:stretch>
+                  </pic:blipFill>
+                  <pic:spPr>
+                    <a:xfrm>
+                      <a:off x="0" y="0"/>
+                      <a:ext cx="4516420" cy="4516420"/>
+                    </a:xfrm>
+                    <a:prstGeom prst="rect">
+                      <a:avLst/>
+                    </a:prstGeom>
+                  </pic:spPr>
+                </pic:pic>
+              </a:graphicData>
+            </a:graphic>
+          </wp:inline>
+        </w:drawing>
+      </w:r>
+    </w:p>
+    <w:p>
+      <w:pPr>
+        <w:pageBreakBefore/>
+        <w:rPr>
+          <w:b/>
+          <w:bCs/>
+        </w:rPr>
+      </w:pPr>
+      <w:r>
+        <w:rPr>
+          <w:b/>
+          <w:bCs/>
+        </w:rPr>
+        <w:lastRenderedPageBreak/>
+        <w:t>Figure 1</w:t>
+      </w:r>
+      <w:r>
+        <w:rPr>
+          <w:b/>
+          <w:bCs/>
+        </w:rPr>
+        <w:t>.</w:t>
+      </w:r>
+      <w:r>
+        <w:rPr>
+          <w:b/>
+          <w:bCs/>
+        </w:rPr>
+        <w:t xml:space="preserve"> Figure 1</w:t>
+      </w:r>
+      <w:r>
+        <w:rPr>
+          <w:b/>
+          <w:bCs/>
+        </w:rPr>
+        <w:t xml:space="preserve"> </w:t>
+      </w:r>
+      <w:r>
+        <w:rPr>
+          <w:b/>
+          <w:bCs/>
+        </w:rPr>
+        <w:t>continued</w:t>
+      </w:r>
+      <w:r>
+        <w:rPr>
+          <w:b/>
+          <w:bCs/>
+        </w:rPr>
+        <w:t xml:space="preserve"> </w:t>
+      </w:r>
+    </w:p>
+    <w:p>
+      <w:pPr>
+        <w:jc w:val="center"/>
+        <w:rPr>
+          <w:b/>
+          <w:bCs/>
+        </w:rPr>
+      </w:pPr>
+    </w:p>
+    <w:p>
+      <w:pPr>
+        <w:jc w:val="center"/>
+      </w:pPr>
+      <w:r>
+        <w:rPr>
+          <w:noProof/>
+          <w14:ligatures w14:val="standardContextual"/>
+        </w:rPr>
+        <w:drawing>
+          <wp:inline distT="0" distB="0" distL="0" distR="0" wp14:anchorId="7A1498D2" wp14:editId="3F2D183F">
+            <wp:extent cx="4473526" cy="4473526"/>
+            <wp:effectExtent l="0" t="0" r="0" b="0"/>
+            <wp:docPr id="521702289" name="Picture 1"/>
+            <wp:cNvGraphicFramePr>
+              <a:graphicFrameLocks xmlns:a="http://schemas.openxmlformats.org/drawingml/2006/main" noChangeAspect="1"/>
+            </wp:cNvGraphicFramePr>
+            <a:graphic xmlns:a="http://schemas.openxmlformats.org/drawingml/2006/main">
+              <a:graphicData uri="http://schemas.openxmlformats.org/drawingml/2006/picture">
+                <pic:pic xmlns:pic="http://schemas.openxmlformats.org/drawingml/2006/picture">
+                  <pic:nvPicPr>
+                    <pic:cNvPr id="521702289" name="Picture 521702289"/>
+                    <pic:cNvPicPr/>
+                  </pic:nvPicPr>
+                  <pic:blipFill>
+                    <a:blip r:embed="rId14">
+                      <a:extLst>
+                        <a:ext uri="{28A0092B-C50C-407E-A947-70E740481C1C}">
+                          <a14:useLocalDpi xmlns:a14="http://schemas.microsoft.com/office/drawing/2010/main" val="0"/>
+                        </a:ext>
+                      </a:extLst>
+                    </a:blip>
+                    <a:stretch>
+                      <a:fillRect/>
+                    </a:stretch>
+                  </pic:blipFill>
+                  <pic:spPr>
+                    <a:xfrm>
+                      <a:off x="0" y="0"/>
+                      <a:ext cx="4491601" cy="4491601"/>
+                    </a:xfrm>
+                    <a:prstGeom prst="rect">
+                      <a:avLst/>
+                    </a:prstGeom>
+                  </pic:spPr>
+                </pic:pic>
+              </a:graphicData>
+            </a:graphic>
+          </wp:inline>
+        </w:drawing>
+      </w:r>
+    </w:p>
     <w:sectPr>
       <w:pgSz w:w="11906" w:h="16838"/>
       <w:pgMar w:top="1440" w:right="1440" w:bottom="1440" w:left="1440" w:header="708" w:footer="708" w:gutter="0"/>
@@ -816,10 +995,6 @@
     </w:sectPr>
   </w:body>
 </w:document>
-</file>
-
-<file path=word/numbering.xml><?xml version="1.0" encoding="utf-8"?>
-<w:numbering xmlns:wpc="http://schemas.microsoft.com/office/word/2010/wordprocessingCanvas" xmlns:cx="http://schemas.microsoft.com/office/drawing/2014/chartex" xmlns:cx1="http://schemas.microsoft.com/office/drawing/2015/9/8/chartex" xmlns:cx2="http://schemas.microsoft.com/office/drawing/2015/10/21/chartex" xmlns:cx3="http://schemas.microsoft.com/office/drawing/2016/5/9/chartex" xmlns:cx4="http://schemas.microsoft.com/office/drawing/2016/5/10/chartex" xmlns:cx5="http://schemas.microsoft.com/office/drawing/2016/5/11/chartex" xmlns:cx6="http://schemas.microsoft.com/office/drawing/2016/5/12/chartex" xmlns:cx7="http://schemas.microsoft.com/office/drawing/2016/5/13/chartex" xmlns:cx8="http://schemas.microsoft.com/office/drawing/2016/5/14/chartex" xmlns:mc="http://schemas.openxmlformats.org/markup-compatibility/2006" xmlns:aink="http://schemas.microsoft.com/office/drawing/2016/ink" xmlns:am3d="http://schemas.microsoft.com/office/drawing/2017/model3d" xmlns:o="urn:schemas-microsoft-com:office:office" xmlns:oel="http://schemas.microsoft.com/office/2019/extlst" xmlns:r="http://schemas.openxmlformats.org/officeDocument/2006/relationships" xmlns:m="http://schemas.openxmlformats.org/officeDocument/2006/math" xmlns:v="urn:schemas-microsoft-com:vml" xmlns:wp14="http://schemas.microsoft.com/office/word/2010/wordprocessingDrawing" xmlns:wp="http://schemas.openxmlformats.org/drawingml/2006/wordprocessingDrawing" xmlns:w10="urn:schemas-microsoft-com:office:word" xmlns:w="http://schemas.openxmlformats.org/wordprocessingml/2006/main" xmlns:w14="http://schemas.microsoft.com/office/word/2010/wordml" xmlns:w15="http://schemas.microsoft.com/office/word/2012/wordml" xmlns:w16cex="http://schemas.microsoft.com/office/word/2018/wordml/cex" xmlns:w16cid="http://schemas.microsoft.com/office/word/2016/wordml/cid" xmlns:w16="http://schemas.microsoft.com/office/word/2018/wordml" xmlns:w16du="http://schemas.microsoft.com/office/word/2023/wordml/word16du" xmlns:w16sdtdh="http://schemas.microsoft.com/office/word/2020/wordml/sdtdatahash" xmlns:w16sdtfl="http://schemas.microsoft.com/office/word/2024/wordml/sdtformatlock" xmlns:w16se="http://schemas.microsoft.com/office/word/2015/wordml/symex" xmlns:wpg="http://schemas.microsoft.com/office/word/2010/wordprocessingGroup" xmlns:wpi="http://schemas.microsoft.com/office/word/2010/wordprocessingInk" xmlns:wne="http://schemas.microsoft.com/office/word/2006/wordml" xmlns:wps="http://schemas.microsoft.com/office/word/2010/wordprocessingShape" mc:Ignorable="w14 w15 w16se w16cid w16 w16cex w16sdtdh w16sdtfl w16du wp14"/>
 </file>
 
 <file path=word/styles.xml><?xml version="1.0" encoding="utf-8"?>
@@ -1447,6 +1622,7 @@
   </w:style>
   <w:style w:type="character" w:customStyle="1" w:styleId="Heading1Char">
     <w:name w:val="Heading 1 Char"/>
+    <w:aliases w:val="PhD Heading 1 Char"/>
     <w:basedOn w:val="DefaultParagraphFont"/>
     <w:link w:val="Heading1"/>
     <w:uiPriority w:val="9"/>
@@ -1460,6 +1636,7 @@
   </w:style>
   <w:style w:type="character" w:customStyle="1" w:styleId="Heading2Char">
     <w:name w:val="Heading 2 Char"/>
+    <w:aliases w:val="PhD Heading 2 Char"/>
     <w:basedOn w:val="DefaultParagraphFont"/>
     <w:link w:val="Heading2"/>
     <w:uiPriority w:val="9"/>
@@ -1474,6 +1651,7 @@
   </w:style>
   <w:style w:type="character" w:customStyle="1" w:styleId="Heading3Char">
     <w:name w:val="Heading 3 Char"/>
+    <w:aliases w:val="PhD Heading 3 Char"/>
     <w:basedOn w:val="DefaultParagraphFont"/>
     <w:link w:val="Heading3"/>
     <w:uiPriority w:val="9"/>
@@ -1488,6 +1666,7 @@
   </w:style>
   <w:style w:type="character" w:customStyle="1" w:styleId="Heading4Char">
     <w:name w:val="Heading 4 Char"/>
+    <w:aliases w:val="PhD Heading 4 Char"/>
     <w:basedOn w:val="DefaultParagraphFont"/>
     <w:link w:val="Heading4"/>
     <w:uiPriority w:val="9"/>
@@ -1502,6 +1681,7 @@
   </w:style>
   <w:style w:type="character" w:customStyle="1" w:styleId="Heading5Char">
     <w:name w:val="Heading 5 Char"/>
+    <w:aliases w:val="PhD Heading 5 Char"/>
     <w:basedOn w:val="DefaultParagraphFont"/>
     <w:link w:val="Heading5"/>
     <w:uiPriority w:val="9"/>

</xml_diff>